<commit_message>
Strengthen Apryse cover letter: sales/quota component ran through every role, not just titled sales roles
</commit_message>
<xml_diff>
--- a/applications/apryse-account-manager-commercial/Rotenberg Cover Letter - Apryse - Account Manager, Commercial.docx
+++ b/applications/apryse-account-manager-commercial/Rotenberg Cover Letter - Apryse - Account Manager, Commercial.docx
@@ -94,7 +94,7 @@
           <w:b w:val="0"/>
           <w:color w:val="1A1A1A"/>
         </w:rPr>
-        <w:t>I'm applying for the Account Manager, Commercial role. I'm based in the Denver metro, and the combination of consultative selling to technical executives and multi-year quota overachievement this role asks for is the exact shape of what I did at Accelo.</w:t>
+        <w:t>I'm applying for the Account Manager, Commercial role. I'm based in the Denver metro, and the combination of consultative selling to technical executives and multi-year quota overachievement this role asks for is the exact shape of what I've done my entire career.</w:t>
       </w:r>
     </w:p>
     <w:p>
@@ -107,7 +107,7 @@
           <w:b w:val="0"/>
           <w:color w:val="1A1A1A"/>
         </w:rPr>
-        <w:t>At Accelo, I ranked top three in sales on a team of 8 to 15 reps for effectively my entire tenure, holding that ranking while quota roughly doubled, selling and scoping complex CRM and project-management software to agencies and professional-services firms. That meant building relationships with C-suite executives as a trusted advisor on operational system design, not just pitching features, understanding how a prospect's business actually worked and showing them where a system change would matter. I managed the full cycle in Salesforce and closed deals that required real negotiation, not just a signature. Since then, I've closed new-logo deals at Fetch &amp; Funnel, onboarded technical business software for reseller partners at Birdeye, and now run my own practice at Solenzo, where I own the full relationship for every client myself.</w:t>
+        <w:t>Every job I've had has carried a sales or quota component, whether or not the title said so. At Accelo, I ranked top three in sales on a team of 8 to 15 reps for effectively my entire tenure, holding that ranking while quota roughly doubled, selling and scoping complex CRM and project-management software to agencies and professional-services firms. That meant building relationships with C-suite executives as a trusted advisor on operational system design, not just pitching features, understanding how a prospect's business actually worked and showing them where a system change would matter. I managed the full cycle in Salesforce and closed deals that required real negotiation, not just a signature. Since then, I've closed new-logo deals at Fetch &amp; Funnel, held 120% of sales target at Wix, managed partner deals worth up to $45K at Birdeye, and now run my own practice at Solenzo, where I own the full sales relationship for every client myself.</w:t>
       </w:r>
     </w:p>
     <w:p>
@@ -120,7 +120,7 @@
           <w:b w:val="0"/>
           <w:color w:val="1A1A1A"/>
         </w:rPr>
-        <w:t>I don't have hands-on experience with Outreach, Dooly, or ZoomInfo specifically, though I've prospected and qualified leads consistently across every sales role I've held. I'd welcome the chance to talk through how that track record applies to selling Apryse's document technology to technical buyers.</w:t>
+        <w:t>I don't have hands-on experience with Outreach, Dooly, or ZoomInfo specifically, though prospecting and qualifying leads has been constant across every one of those roles. I'd welcome the chance to talk through how that track record applies to selling Apryse's document technology to technical buyers.</w:t>
       </w:r>
     </w:p>
     <w:p>

</xml_diff>